<commit_message>
Update weekly report 9
</commit_message>
<xml_diff>
--- a/BaoCao/bao-cao-tuan/BaoCao_Tuan9.docx
+++ b/BaoCao/bao-cao-tuan/BaoCao_Tuan9.docx
@@ -241,6 +241,118 @@
           <w:p>
             <w:r>
               <w:t>-  Kiểm tra responsive trên mobile (đa số khách đặt vé qua điện thoại) — đảm bảo CTA "Đặt vé" luôn nằm trong vùng tap-friendly.</w:t>
+            </w:r>
+          </w:p>
+          <w:p>
+            <w:r>
+              <w:rPr>
+                <w:b/>
+              </w:rPr>
+              <w:t>Tối ưu trải nghiệm tài xế: trang /driver nhanh, gọn, hoạt động được trên 3G</w:t>
+            </w:r>
+          </w:p>
+          <w:p>
+            <w:r>
+              <w:t>-  Vấn đề: tài xế chạy đường dài hay vùng sóng yếu, mở /driver quét QR vé nhiều khi xoay vòng load 5-10s, đôi khi danh sách xe không hiện đủ.</w:t>
+            </w:r>
+          </w:p>
+          <w:p>
+            <w:r>
+              <w:t>-  Bật cache HTTP cho endpoint /api/tong-hop/vehicles + /drivers + /timeslots (Cache-Control s-maxage=30) → lần thứ 2 mở trong 30s phản hồi tức thì từ Vercel edge.</w:t>
+            </w:r>
+          </w:p>
+          <w:p>
+            <w:r>
+              <w:t>-  Giảm payload trả về: chỉ select các cột cần (id, plate, type, code) thay vì SELECT * → giảm ~40% bytes truyền xuống điện thoại.</w:t>
+            </w:r>
+          </w:p>
+          <w:p>
+            <w:r>
+              <w:t>-  Hiện toast trạng thái mạng khi navigator.onLine = false thay vì để tài xế bấm vào nút xám ngơ ngác.</w:t>
+            </w:r>
+          </w:p>
+          <w:p>
+            <w:r>
+              <w:rPr>
+                <w:b/>
+              </w:rPr>
+              <w:t>Realtime đối soát: cron reconciliation đêm cho NhapHang ↔ TongHop</w:t>
+            </w:r>
+          </w:p>
+          <w:p>
+            <w:r>
+              <w:t>-  Vấn đề: dù đã có fire-and-forget sync khi tạo đơn dọc đường + polling 3s, vẫn có trường hợp sync miss khi Vercel cold-start hoặc Neon DB lag → cuối ngày phát hiện vài đơn NhapHang không có booking TongHop tương ứng.</w:t>
+            </w:r>
+          </w:p>
+          <w:p>
+            <w:r>
+              <w:t>-  Thêm Vercel Cron 01h00 hàng ngày (Hobby plan chỉ cho 1 cron/day): quét toàn bộ Products status=pending của hôm trước có isDocDuong(station) = true mà chưa có TH_Bookings với clientReqId tương ứng → tự gọi createTongHopBooking() để bù.</w:t>
+            </w:r>
+          </w:p>
+          <w:p>
+            <w:r>
+              <w:t>-  Log từng case bù sync vào ProductLogs với action="reconcile" để truy vết khi có khiếu nại.</w:t>
+            </w:r>
+          </w:p>
+          <w:p>
+            <w:r>
+              <w:t>-  Mục tiêu: 0 đơn dọc đường bị miss sync — đạt SLA 100% mỗi sáng đầu ca.</w:t>
+            </w:r>
+          </w:p>
+          <w:p>
+            <w:r>
+              <w:rPr>
+                <w:b/>
+              </w:rPr>
+              <w:t>Bảo mật: rate-limit + brute-force protection cho cổng đăng nhập</w:t>
+            </w:r>
+          </w:p>
+          <w:p>
+            <w:r>
+              <w:t>-  Vấn đề: 2 trang đăng nhập (NhapHang + TongHop) chưa giới hạn số lần thử sai password → dễ bị dò bằng script.</w:t>
+            </w:r>
+          </w:p>
+          <w:p>
+            <w:r>
+              <w:t>-  Thêm in-memory bucket đếm số lần POST /login sai theo IP: quá 5 lần trong 5 phút → trả 429 + khoá 15 phút (không cần Redis, Vercel function memory đủ trong cùng 1 region).</w:t>
+            </w:r>
+          </w:p>
+          <w:p>
+            <w:r>
+              <w:t>-  Log mỗi attempt sai vào bảng AuditLogs với IP + username + timestamp → admin tra được ai bị tấn công.</w:t>
+            </w:r>
+          </w:p>
+          <w:p>
+            <w:r>
+              <w:t>-  Cảnh báo trên UI khi user còn 1 lần thử cuối, tránh khoá oan user gõ nhầm password.</w:t>
+            </w:r>
+          </w:p>
+          <w:p>
+            <w:r>
+              <w:rPr>
+                <w:b/>
+              </w:rPr>
+              <w:t>Chuẩn bị phần demo + slide bảo vệ đồ án</w:t>
+            </w:r>
+          </w:p>
+          <w:p>
+            <w:r>
+              <w:t>-  Soạn dàn slide bảo vệ: giới thiệu nhà xe → bài toán 2 luồng nghiệp vụ → kiến trúc 4 web + 2 app + 3 DB → demo 6 luồng chính (đặt vé online, bán quầy, quét QR, ký gửi, dọc đường, dashboard).</w:t>
+            </w:r>
+          </w:p>
+          <w:p>
+            <w:r>
+              <w:t>-  Quay video demo 5-7 phút cho từng luồng để chèn vào slide, phòng trường hợp mạng phòng bảo vệ chậm không demo live được.</w:t>
+            </w:r>
+          </w:p>
+          <w:p>
+            <w:r>
+              <w:t>-  Chuẩn bị bộ câu hỏi giảng viên hay hỏi: tại sao chọn Neon mà không Supabase, tại sao monorepo mà không microservice, idempotency thực hiện thế nào, schema migration ra sao — có sẵn câu trả lời ngắn 1-2 câu.</w:t>
+            </w:r>
+          </w:p>
+          <w:p>
+            <w:r>
+              <w:t>-  In bộ tài liệu BaoCao/01-05 + 7 báo cáo tuần ra giấy đóng quyển, sẵn nộp khi yêu cầu bản cứng.</w:t>
             </w:r>
           </w:p>
         </w:tc>

</xml_diff>